<commit_message>
updated peer to peer lending platform growth analysis
</commit_message>
<xml_diff>
--- a/Research_Papers/Research_Paper_1_Topic_Related.docx
+++ b/Research_Papers/Research_Paper_1_Topic_Related.docx
@@ -233,12 +233,7 @@
         <w:spacing w:before="0" w:beforeAutospacing="0" w:after="0" w:afterAutospacing="0"/>
       </w:pPr>
       <w:r>
-        <w:t xml:space="preserve">P2P lending is part of the Fin Tech sector and provides a digital alternative to traditional lending. </w:t>
-      </w:r>
-      <w:bookmarkStart w:id="0" w:name="_GoBack"/>
-      <w:bookmarkEnd w:id="0"/>
-      <w:r>
-        <w:t>Platforms collect information about borrowers and loans to support funding and repayment processes.</w:t>
+        <w:t>P2P lending is part of the Fin Tech sector and provides a digital alternative to traditional lending. Platforms collect information about borrowers and loans to support funding and repayment processes.</w:t>
       </w:r>
     </w:p>
     <w:p>
@@ -527,12 +522,17 @@
     <w:p>
       <w:pPr>
         <w:pStyle w:val="Heading1"/>
+        <w:rPr>
+          <w:sz w:val="26"/>
+          <w:szCs w:val="26"/>
+        </w:rPr>
       </w:pPr>
       <w:r>
         <w:rPr>
           <w:rStyle w:val="Strong"/>
-          <w:b w:val="0"/>
           <w:bCs w:val="0"/>
+          <w:sz w:val="26"/>
+          <w:szCs w:val="26"/>
         </w:rPr>
         <w:t>6. Risk and Loan Defaults</w:t>
       </w:r>
@@ -585,12 +585,17 @@
     <w:p>
       <w:pPr>
         <w:pStyle w:val="Heading1"/>
+        <w:rPr>
+          <w:sz w:val="26"/>
+          <w:szCs w:val="26"/>
+        </w:rPr>
       </w:pPr>
       <w:r>
         <w:rPr>
           <w:rStyle w:val="Strong"/>
-          <w:b w:val="0"/>
           <w:bCs w:val="0"/>
+          <w:sz w:val="26"/>
+          <w:szCs w:val="26"/>
         </w:rPr>
         <w:t>7. Review of Existing Studies</w:t>
       </w:r>
@@ -625,12 +630,17 @@
     <w:p>
       <w:pPr>
         <w:pStyle w:val="Heading1"/>
+        <w:rPr>
+          <w:sz w:val="26"/>
+          <w:szCs w:val="26"/>
+        </w:rPr>
       </w:pPr>
       <w:r>
         <w:rPr>
           <w:rStyle w:val="Strong"/>
-          <w:b w:val="0"/>
           <w:bCs w:val="0"/>
+          <w:sz w:val="26"/>
+          <w:szCs w:val="26"/>
         </w:rPr>
         <w:t>8. Role of Data Analysis in P2P Lending</w:t>
       </w:r>
@@ -836,12 +846,17 @@
     <w:p>
       <w:pPr>
         <w:pStyle w:val="Heading1"/>
+        <w:rPr>
+          <w:sz w:val="26"/>
+          <w:szCs w:val="26"/>
+        </w:rPr>
       </w:pPr>
       <w:r>
         <w:rPr>
           <w:rStyle w:val="Strong"/>
-          <w:b w:val="0"/>
           <w:bCs w:val="0"/>
+          <w:sz w:val="26"/>
+          <w:szCs w:val="26"/>
         </w:rPr>
         <w:lastRenderedPageBreak/>
         <w:t>9. Connection with the Current Project</w:t>
@@ -895,12 +910,17 @@
     <w:p>
       <w:pPr>
         <w:pStyle w:val="Heading1"/>
+        <w:rPr>
+          <w:sz w:val="26"/>
+          <w:szCs w:val="26"/>
+        </w:rPr>
       </w:pPr>
       <w:r>
         <w:rPr>
           <w:rStyle w:val="Strong"/>
-          <w:b w:val="0"/>
           <w:bCs w:val="0"/>
+          <w:sz w:val="26"/>
+          <w:szCs w:val="26"/>
         </w:rPr>
         <w:t>10. Findings from the Project</w:t>
       </w:r>
@@ -1157,12 +1177,17 @@
     <w:p>
       <w:pPr>
         <w:pStyle w:val="Heading1"/>
+        <w:rPr>
+          <w:sz w:val="26"/>
+          <w:szCs w:val="26"/>
+        </w:rPr>
       </w:pPr>
       <w:r>
         <w:rPr>
           <w:rStyle w:val="Strong"/>
-          <w:b w:val="0"/>
           <w:bCs w:val="0"/>
+          <w:sz w:val="26"/>
+          <w:szCs w:val="26"/>
         </w:rPr>
         <w:t>11. Limitations</w:t>
       </w:r>
@@ -1191,18 +1216,28 @@
         <w:spacing w:before="0" w:beforeAutospacing="0"/>
       </w:pPr>
       <w:r>
-        <w:t>The findings therefore describe the selected dataset and should not automatically be considered representative of the entire P2P lending industry.</w:t>
+        <w:t>The findings therefore describe the selected dataset and should not automatically be considered representative of the entire P2P lendin</w:t>
+      </w:r>
+      <w:bookmarkStart w:id="0" w:name="_GoBack"/>
+      <w:bookmarkEnd w:id="0"/>
+      <w:r>
+        <w:t>g industry.</w:t>
       </w:r>
     </w:p>
     <w:p>
       <w:pPr>
         <w:pStyle w:val="Heading1"/>
+        <w:rPr>
+          <w:sz w:val="26"/>
+          <w:szCs w:val="26"/>
+        </w:rPr>
       </w:pPr>
       <w:r>
         <w:rPr>
           <w:rStyle w:val="Strong"/>
-          <w:b w:val="0"/>
           <w:bCs w:val="0"/>
+          <w:sz w:val="26"/>
+          <w:szCs w:val="26"/>
         </w:rPr>
         <w:t>12. Conclusion</w:t>
       </w:r>
@@ -1236,12 +1271,17 @@
     <w:p>
       <w:pPr>
         <w:pStyle w:val="Heading1"/>
+        <w:rPr>
+          <w:sz w:val="26"/>
+          <w:szCs w:val="26"/>
+        </w:rPr>
       </w:pPr>
       <w:r>
         <w:rPr>
           <w:rStyle w:val="Strong"/>
-          <w:b w:val="0"/>
           <w:bCs w:val="0"/>
+          <w:sz w:val="26"/>
+          <w:szCs w:val="26"/>
         </w:rPr>
         <w:t>References</w:t>
       </w:r>

</xml_diff>